<commit_message>
Update Explainable Network Intrusion Detection In 5G Networks.docx
</commit_message>
<xml_diff>
--- a/Explainable Network Intrusion Detection In 5G Networks.docx
+++ b/Explainable Network Intrusion Detection In 5G Networks.docx
@@ -4057,8 +4057,8 @@
                                   <w:rPr>
                                     <w:rFonts w:asciiTheme="majorHAnsi" w:eastAsiaTheme="majorEastAsia" w:hAnsiTheme="majorHAnsi" w:cstheme="majorBidi"/>
                                     <w:color w:val="262626" w:themeColor="text1" w:themeTint="D9"/>
-                                    <w:sz w:val="40"/>
-                                    <w:szCs w:val="40"/>
+                                    <w:sz w:val="36"/>
+                                    <w:szCs w:val="36"/>
                                     <w:lang w:val="el-GR"/>
                                     <w14:ligatures w14:val="none"/>
                                   </w:rPr>
@@ -4068,8 +4068,8 @@
                                     <w:rPr>
                                       <w:rFonts w:asciiTheme="majorHAnsi" w:eastAsiaTheme="majorEastAsia" w:hAnsiTheme="majorHAnsi" w:cstheme="majorBidi"/>
                                       <w:color w:val="262626" w:themeColor="text1" w:themeTint="D9"/>
-                                      <w:sz w:val="40"/>
-                                      <w:szCs w:val="40"/>
+                                      <w:sz w:val="36"/>
+                                      <w:szCs w:val="36"/>
                                       <w:lang w:val="el-GR"/>
                                       <w14:ligatures w14:val="none"/>
                                     </w:rPr>
@@ -4084,12 +4084,12 @@
                                       <w:rPr>
                                         <w:rFonts w:asciiTheme="majorHAnsi" w:eastAsiaTheme="majorEastAsia" w:hAnsiTheme="majorHAnsi" w:cstheme="majorBidi"/>
                                         <w:color w:val="262626" w:themeColor="text1" w:themeTint="D9"/>
-                                        <w:sz w:val="40"/>
-                                        <w:szCs w:val="40"/>
+                                        <w:sz w:val="36"/>
+                                        <w:szCs w:val="36"/>
                                         <w:lang w:val="el-GR"/>
                                         <w14:ligatures w14:val="none"/>
                                       </w:rPr>
-                                      <w:t>Αρχιτεκτονικές Δικτύων Επόμενης Γενιάς Τεχνολογίες &amp; Εφαρμογές</w:t>
+                                      <w:t>ΑΡΧΙΤΕΚΤΟΝΙΚΕΣ ΔΙΚΤΥΩΝ ΕΠΟΜΕΝΗΣ ΓΕΝΙΑΣ, ΤΕΧΝΟΛΟΓΙΕΣ ΚΑΙ ΕΦΑΡΜΟΓΕΣ</w:t>
                                     </w:r>
                                   </w:sdtContent>
                                 </w:sdt>
@@ -4100,7 +4100,6 @@
                                   <w:rPr>
                                     <w:sz w:val="20"/>
                                     <w:szCs w:val="20"/>
-                                    <w:lang w:val="el-GR"/>
                                   </w:rPr>
                                 </w:pPr>
                                 <w:r>
@@ -4108,14 +4107,7 @@
                                     <w:sz w:val="20"/>
                                     <w:szCs w:val="20"/>
                                   </w:rPr>
-                                  <w:t>Project</w:t>
-                                </w:r>
-                                <w:r>
-                                  <w:rPr>
-                                    <w:sz w:val="20"/>
-                                    <w:szCs w:val="20"/>
-                                  </w:rPr>
-                                  <w:t xml:space="preserve"> 9:</w:t>
+                                  <w:t>Project 9:</w:t>
                                 </w:r>
                                 <w:r>
                                   <w:rPr>
@@ -4170,8 +4162,8 @@
                             <w:rPr>
                               <w:rFonts w:asciiTheme="majorHAnsi" w:eastAsiaTheme="majorEastAsia" w:hAnsiTheme="majorHAnsi" w:cstheme="majorBidi"/>
                               <w:color w:val="262626" w:themeColor="text1" w:themeTint="D9"/>
-                              <w:sz w:val="40"/>
-                              <w:szCs w:val="40"/>
+                              <w:sz w:val="36"/>
+                              <w:szCs w:val="36"/>
                               <w:lang w:val="el-GR"/>
                               <w14:ligatures w14:val="none"/>
                             </w:rPr>
@@ -4181,8 +4173,8 @@
                               <w:rPr>
                                 <w:rFonts w:asciiTheme="majorHAnsi" w:eastAsiaTheme="majorEastAsia" w:hAnsiTheme="majorHAnsi" w:cstheme="majorBidi"/>
                                 <w:color w:val="262626" w:themeColor="text1" w:themeTint="D9"/>
-                                <w:sz w:val="40"/>
-                                <w:szCs w:val="40"/>
+                                <w:sz w:val="36"/>
+                                <w:szCs w:val="36"/>
                                 <w:lang w:val="el-GR"/>
                                 <w14:ligatures w14:val="none"/>
                               </w:rPr>
@@ -4197,12 +4189,12 @@
                                 <w:rPr>
                                   <w:rFonts w:asciiTheme="majorHAnsi" w:eastAsiaTheme="majorEastAsia" w:hAnsiTheme="majorHAnsi" w:cstheme="majorBidi"/>
                                   <w:color w:val="262626" w:themeColor="text1" w:themeTint="D9"/>
-                                  <w:sz w:val="40"/>
-                                  <w:szCs w:val="40"/>
+                                  <w:sz w:val="36"/>
+                                  <w:szCs w:val="36"/>
                                   <w:lang w:val="el-GR"/>
                                   <w14:ligatures w14:val="none"/>
                                 </w:rPr>
-                                <w:t>Αρχιτεκτονικές Δικτύων Επόμενης Γενιάς Τεχνολογίες &amp; Εφαρμογές</w:t>
+                                <w:t>ΑΡΧΙΤΕΚΤΟΝΙΚΕΣ ΔΙΚΤΥΩΝ ΕΠΟΜΕΝΗΣ ΓΕΝΙΑΣ, ΤΕΧΝΟΛΟΓΙΕΣ ΚΑΙ ΕΦΑΡΜΟΓΕΣ</w:t>
                               </w:r>
                             </w:sdtContent>
                           </w:sdt>
@@ -4213,7 +4205,6 @@
                             <w:rPr>
                               <w:sz w:val="20"/>
                               <w:szCs w:val="20"/>
-                              <w:lang w:val="el-GR"/>
                             </w:rPr>
                           </w:pPr>
                           <w:r>
@@ -4221,14 +4212,7 @@
                               <w:sz w:val="20"/>
                               <w:szCs w:val="20"/>
                             </w:rPr>
-                            <w:t>Project</w:t>
-                          </w:r>
-                          <w:r>
-                            <w:rPr>
-                              <w:sz w:val="20"/>
-                              <w:szCs w:val="20"/>
-                            </w:rPr>
-                            <w:t xml:space="preserve"> 9:</w:t>
+                            <w:t>Project 9:</w:t>
                           </w:r>
                           <w:r>
                             <w:rPr>
@@ -4632,7 +4616,64 @@
           <w:szCs w:val="28"/>
           <w:lang w:val="el-GR"/>
         </w:rPr>
-        <w:t xml:space="preserve">Στις επόμενες σελίδες παρουσιάζονται οι απαντήσεις της ομάδας μας στο </w:t>
+        <w:t xml:space="preserve">Στις επόμενες σελίδες παρουσιάζεται η </w:t>
+      </w:r>
+      <w:r>
+        <w:rPr>
+          <w:rFonts w:asciiTheme="minorHAnsi" w:hAnsiTheme="minorHAnsi"/>
+          <w:color w:val="156082" w:themeColor="accent1"/>
+          <w:sz w:val="28"/>
+          <w:szCs w:val="28"/>
+          <w:lang w:val="el-GR"/>
+        </w:rPr>
+        <w:t>μεθοδολογία</w:t>
+      </w:r>
+      <w:r>
+        <w:rPr>
+          <w:rFonts w:asciiTheme="minorHAnsi" w:hAnsiTheme="minorHAnsi"/>
+          <w:sz w:val="28"/>
+          <w:szCs w:val="28"/>
+          <w:lang w:val="el-GR"/>
+        </w:rPr>
+        <w:t xml:space="preserve">, η </w:t>
+      </w:r>
+      <w:r>
+        <w:rPr>
+          <w:rFonts w:asciiTheme="minorHAnsi" w:hAnsiTheme="minorHAnsi"/>
+          <w:color w:val="156082" w:themeColor="accent1"/>
+          <w:sz w:val="28"/>
+          <w:szCs w:val="28"/>
+          <w:lang w:val="el-GR"/>
+        </w:rPr>
+        <w:t xml:space="preserve">υλοποίηση </w:t>
+      </w:r>
+      <w:r>
+        <w:rPr>
+          <w:rFonts w:asciiTheme="minorHAnsi" w:hAnsiTheme="minorHAnsi"/>
+          <w:sz w:val="28"/>
+          <w:szCs w:val="28"/>
+          <w:lang w:val="el-GR"/>
+        </w:rPr>
+        <w:t xml:space="preserve">και η </w:t>
+      </w:r>
+      <w:r>
+        <w:rPr>
+          <w:rFonts w:asciiTheme="minorHAnsi" w:hAnsiTheme="minorHAnsi"/>
+          <w:color w:val="156082" w:themeColor="accent1"/>
+          <w:sz w:val="28"/>
+          <w:szCs w:val="28"/>
+          <w:lang w:val="el-GR"/>
+        </w:rPr>
+        <w:t xml:space="preserve">πειραματική αξιολόγηση </w:t>
+      </w:r>
+      <w:r>
+        <w:rPr>
+          <w:rFonts w:asciiTheme="minorHAnsi" w:hAnsiTheme="minorHAnsi"/>
+          <w:sz w:val="28"/>
+          <w:szCs w:val="28"/>
+          <w:lang w:val="el-GR"/>
+        </w:rPr>
+        <w:t xml:space="preserve">της ομάδας μας για το </w:t>
       </w:r>
       <w:r>
         <w:rPr>
@@ -4649,7 +4690,25 @@
           <w:szCs w:val="28"/>
           <w:lang w:val="el-GR"/>
         </w:rPr>
-        <w:t xml:space="preserve"> του </w:t>
+        <w:t xml:space="preserve"> 9</w:t>
+      </w:r>
+      <w:r>
+        <w:rPr>
+          <w:rFonts w:asciiTheme="minorHAnsi" w:hAnsiTheme="minorHAnsi"/>
+          <w:sz w:val="28"/>
+          <w:szCs w:val="28"/>
+          <w:lang w:val="el-GR"/>
+        </w:rPr>
+        <w:t xml:space="preserve"> </w:t>
+      </w:r>
+      <w:r>
+        <w:rPr>
+          <w:rFonts w:asciiTheme="minorHAnsi" w:hAnsiTheme="minorHAnsi"/>
+          <w:sz w:val="28"/>
+          <w:szCs w:val="28"/>
+          <w:lang w:val="el-GR"/>
+        </w:rPr>
+        <w:t xml:space="preserve">του </w:t>
       </w:r>
       <w:r>
         <w:rPr>
@@ -4663,7 +4722,7 @@
       <w:r>
         <w:rPr>
           <w:rFonts w:asciiTheme="minorHAnsi" w:hAnsiTheme="minorHAnsi"/>
-          <w:color w:val="156082" w:themeColor="accent1"/>
+          <w:color w:val="4EA72E" w:themeColor="accent6"/>
           <w:sz w:val="28"/>
           <w:szCs w:val="28"/>
           <w:lang w:val="el-GR"/>
@@ -4706,7 +4765,25 @@
           <w:szCs w:val="28"/>
           <w:lang w:val="el-GR"/>
         </w:rPr>
-        <w:t xml:space="preserve">Η ομάδα αποτελέιται από τους εξής φοιτητές: </w:t>
+        <w:t>Η ομάδα αποτελ</w:t>
+      </w:r>
+      <w:r>
+        <w:rPr>
+          <w:rFonts w:asciiTheme="minorHAnsi" w:hAnsiTheme="minorHAnsi"/>
+          <w:sz w:val="28"/>
+          <w:szCs w:val="28"/>
+          <w:lang w:val="el-GR"/>
+        </w:rPr>
+        <w:t>εί</w:t>
+      </w:r>
+      <w:r>
+        <w:rPr>
+          <w:rFonts w:asciiTheme="minorHAnsi" w:hAnsiTheme="minorHAnsi"/>
+          <w:sz w:val="28"/>
+          <w:szCs w:val="28"/>
+          <w:lang w:val="el-GR"/>
+        </w:rPr>
+        <w:t xml:space="preserve">ται από τους εξής φοιτητές: </w:t>
       </w:r>
       <w:r>
         <w:rPr>
@@ -4752,7 +4829,10 @@
     <w:p>
       <w:pPr>
         <w:rPr>
+          <w:rStyle w:val="IntenseEmphasis"/>
           <w:rFonts w:asciiTheme="minorHAnsi" w:hAnsiTheme="minorHAnsi"/>
+          <w:sz w:val="28"/>
+          <w:szCs w:val="28"/>
           <w:lang w:val="el-GR"/>
         </w:rPr>
       </w:pPr>
@@ -4766,6 +4846,14 @@
         </w:rPr>
         <w:t>Παντελής Δημήτριος</w:t>
       </w:r>
+    </w:p>
+    <w:p>
+      <w:pPr>
+        <w:rPr>
+          <w:rFonts w:asciiTheme="minorHAnsi" w:hAnsiTheme="minorHAnsi"/>
+          <w:lang w:val="el-GR"/>
+        </w:rPr>
+      </w:pPr>
     </w:p>
     <w:p>
       <w:pPr>
@@ -5331,6 +5419,7 @@
                                 <w:color w:val="153D63" w:themeColor="text2" w:themeTint="E6"/>
                                 <w:sz w:val="32"/>
                                 <w:szCs w:val="32"/>
+                                <w:lang w:val="el-GR"/>
                               </w:rPr>
                             </w:pPr>
                             <w:r>
@@ -5343,6 +5432,16 @@
                               </w:rPr>
                               <w:t>Παντελής</w:t>
                             </w:r>
+                            <w:r>
+                              <w:rPr>
+                                <w:rFonts w:asciiTheme="minorHAnsi" w:hAnsiTheme="minorHAnsi"/>
+                                <w:color w:val="153D63" w:themeColor="text2" w:themeTint="E6"/>
+                                <w:sz w:val="32"/>
+                                <w:szCs w:val="32"/>
+                                <w:lang w:val="el-GR"/>
+                              </w:rPr>
+                              <w:t xml:space="preserve"> </w:t>
+                            </w:r>
                           </w:p>
                           <w:p>
                             <w:pPr>
@@ -5352,6 +5451,7 @@
                                 <w:color w:val="153D63" w:themeColor="text2" w:themeTint="E6"/>
                                 <w:sz w:val="32"/>
                                 <w:szCs w:val="32"/>
+                                <w:lang w:val="el-GR"/>
                               </w:rPr>
                             </w:pPr>
                             <w:r>
@@ -5373,6 +5473,7 @@
                                 <w:color w:val="153D63" w:themeColor="text2" w:themeTint="E6"/>
                                 <w:sz w:val="36"/>
                                 <w:szCs w:val="36"/>
+                                <w:lang w:val="el-GR"/>
                               </w:rPr>
                             </w:pPr>
                             <w:r>
@@ -5381,8 +5482,19 @@
                                 <w:color w:val="153D63" w:themeColor="text2" w:themeTint="E6"/>
                                 <w:sz w:val="32"/>
                                 <w:szCs w:val="32"/>
+                                <w:lang w:val="el-GR"/>
                               </w:rPr>
-                              <w:t>1100562</w:t>
+                              <w:t>110</w:t>
+                            </w:r>
+                            <w:r>
+                              <w:rPr>
+                                <w:rFonts w:asciiTheme="minorHAnsi" w:hAnsiTheme="minorHAnsi"/>
+                                <w:color w:val="153D63" w:themeColor="text2" w:themeTint="E6"/>
+                                <w:sz w:val="32"/>
+                                <w:szCs w:val="32"/>
+                                <w:lang w:val="el-GR"/>
+                              </w:rPr>
+                              <w:t>4777</w:t>
                             </w:r>
                           </w:p>
                           <w:p>
@@ -5393,6 +5505,7 @@
                                 <w:color w:val="153D63" w:themeColor="text2" w:themeTint="E6"/>
                                 <w:sz w:val="28"/>
                                 <w:szCs w:val="28"/>
+                                <w:lang w:val="el-GR"/>
                               </w:rPr>
                             </w:pPr>
                             <w:hyperlink r:id="rId7" w:history="1">
@@ -5403,7 +5516,7 @@
                                   <w:sz w:val="28"/>
                                   <w:szCs w:val="28"/>
                                 </w:rPr>
-                                <w:t>up110</w:t>
+                                <w:t>up</w:t>
                               </w:r>
                               <w:r>
                                 <w:rPr>
@@ -5411,8 +5524,9 @@
                                   <w:rFonts w:asciiTheme="minorHAnsi" w:hAnsiTheme="minorHAnsi"/>
                                   <w:sz w:val="28"/>
                                   <w:szCs w:val="28"/>
+                                  <w:lang w:val="el-GR"/>
                                 </w:rPr>
-                                <w:t>47</w:t>
+                                <w:t>11047</w:t>
                               </w:r>
                               <w:r>
                                 <w:rPr>
@@ -5430,8 +5544,56 @@
                                   <w:rFonts w:asciiTheme="minorHAnsi" w:hAnsiTheme="minorHAnsi"/>
                                   <w:sz w:val="28"/>
                                   <w:szCs w:val="28"/>
+                                  <w:lang w:val="el-GR"/>
                                 </w:rPr>
-                                <w:t>@ac.upatras.gr</w:t>
+                                <w:t>@</w:t>
+                              </w:r>
+                              <w:r>
+                                <w:rPr>
+                                  <w:rStyle w:val="Hyperlink"/>
+                                  <w:rFonts w:asciiTheme="minorHAnsi" w:hAnsiTheme="minorHAnsi"/>
+                                  <w:sz w:val="28"/>
+                                  <w:szCs w:val="28"/>
+                                </w:rPr>
+                                <w:t>ac</w:t>
+                              </w:r>
+                              <w:r>
+                                <w:rPr>
+                                  <w:rStyle w:val="Hyperlink"/>
+                                  <w:rFonts w:asciiTheme="minorHAnsi" w:hAnsiTheme="minorHAnsi"/>
+                                  <w:sz w:val="28"/>
+                                  <w:szCs w:val="28"/>
+                                  <w:lang w:val="el-GR"/>
+                                </w:rPr>
+                                <w:t>.</w:t>
+                              </w:r>
+                              <w:r>
+                                <w:rPr>
+                                  <w:rStyle w:val="Hyperlink"/>
+                                  <w:rFonts w:asciiTheme="minorHAnsi" w:hAnsiTheme="minorHAnsi"/>
+                                  <w:sz w:val="28"/>
+                                  <w:szCs w:val="28"/>
+                                </w:rPr>
+                                <w:t>upatras</w:t>
+                              </w:r>
+                              <w:r>
+                                <w:rPr>
+                                  <w:rStyle w:val="Hyperlink"/>
+                                  <w:rFonts w:asciiTheme="minorHAnsi" w:hAnsiTheme="minorHAnsi"/>
+                                  <w:sz w:val="28"/>
+                                  <w:szCs w:val="28"/>
+                                  <w:lang w:val="el-GR"/>
+                                </w:rPr>
+                                <w:t>.</w:t>
+                              </w:r>
+                              <w:r>
+                                <w:rPr>
+                                  <w:rStyle w:val="Hyperlink"/>
+                                  <w:rFonts w:asciiTheme="minorHAnsi" w:hAnsiTheme="minorHAnsi"/>
+                                  <w:sz w:val="28"/>
+                                  <w:szCs w:val="28"/>
+                                </w:rPr>
+                                <w:t>gr</w:t>
                               </w:r>
                             </w:hyperlink>
                           </w:p>
@@ -5444,6 +5606,7 @@
                                 <w:color w:val="153D63" w:themeColor="text2" w:themeTint="E6"/>
                                 <w:sz w:val="28"/>
                                 <w:szCs w:val="28"/>
+                                <w:lang w:val="el-GR"/>
                               </w:rPr>
                             </w:pPr>
                           </w:p>
@@ -5495,6 +5658,7 @@
                           <w:color w:val="153D63" w:themeColor="text2" w:themeTint="E6"/>
                           <w:sz w:val="32"/>
                           <w:szCs w:val="32"/>
+                          <w:lang w:val="el-GR"/>
                         </w:rPr>
                       </w:pPr>
                       <w:r>
@@ -5507,6 +5671,16 @@
                         </w:rPr>
                         <w:t>Παντελής</w:t>
                       </w:r>
+                      <w:r>
+                        <w:rPr>
+                          <w:rFonts w:asciiTheme="minorHAnsi" w:hAnsiTheme="minorHAnsi"/>
+                          <w:color w:val="153D63" w:themeColor="text2" w:themeTint="E6"/>
+                          <w:sz w:val="32"/>
+                          <w:szCs w:val="32"/>
+                          <w:lang w:val="el-GR"/>
+                        </w:rPr>
+                        <w:t xml:space="preserve"> </w:t>
+                      </w:r>
                     </w:p>
                     <w:p>
                       <w:pPr>
@@ -5516,6 +5690,7 @@
                           <w:color w:val="153D63" w:themeColor="text2" w:themeTint="E6"/>
                           <w:sz w:val="32"/>
                           <w:szCs w:val="32"/>
+                          <w:lang w:val="el-GR"/>
                         </w:rPr>
                       </w:pPr>
                       <w:r>
@@ -5537,6 +5712,7 @@
                           <w:color w:val="153D63" w:themeColor="text2" w:themeTint="E6"/>
                           <w:sz w:val="36"/>
                           <w:szCs w:val="36"/>
+                          <w:lang w:val="el-GR"/>
                         </w:rPr>
                       </w:pPr>
                       <w:r>
@@ -5545,8 +5721,19 @@
                           <w:color w:val="153D63" w:themeColor="text2" w:themeTint="E6"/>
                           <w:sz w:val="32"/>
                           <w:szCs w:val="32"/>
+                          <w:lang w:val="el-GR"/>
                         </w:rPr>
-                        <w:t>1100562</w:t>
+                        <w:t>110</w:t>
+                      </w:r>
+                      <w:r>
+                        <w:rPr>
+                          <w:rFonts w:asciiTheme="minorHAnsi" w:hAnsiTheme="minorHAnsi"/>
+                          <w:color w:val="153D63" w:themeColor="text2" w:themeTint="E6"/>
+                          <w:sz w:val="32"/>
+                          <w:szCs w:val="32"/>
+                          <w:lang w:val="el-GR"/>
+                        </w:rPr>
+                        <w:t>4777</w:t>
                       </w:r>
                     </w:p>
                     <w:p>
@@ -5557,6 +5744,7 @@
                           <w:color w:val="153D63" w:themeColor="text2" w:themeTint="E6"/>
                           <w:sz w:val="28"/>
                           <w:szCs w:val="28"/>
+                          <w:lang w:val="el-GR"/>
                         </w:rPr>
                       </w:pPr>
                       <w:hyperlink r:id="rId8" w:history="1">
@@ -5567,7 +5755,7 @@
                             <w:sz w:val="28"/>
                             <w:szCs w:val="28"/>
                           </w:rPr>
-                          <w:t>up110</w:t>
+                          <w:t>up</w:t>
                         </w:r>
                         <w:r>
                           <w:rPr>
@@ -5575,8 +5763,9 @@
                             <w:rFonts w:asciiTheme="minorHAnsi" w:hAnsiTheme="minorHAnsi"/>
                             <w:sz w:val="28"/>
                             <w:szCs w:val="28"/>
+                            <w:lang w:val="el-GR"/>
                           </w:rPr>
-                          <w:t>47</w:t>
+                          <w:t>11047</w:t>
                         </w:r>
                         <w:r>
                           <w:rPr>
@@ -5594,8 +5783,56 @@
                             <w:rFonts w:asciiTheme="minorHAnsi" w:hAnsiTheme="minorHAnsi"/>
                             <w:sz w:val="28"/>
                             <w:szCs w:val="28"/>
+                            <w:lang w:val="el-GR"/>
                           </w:rPr>
-                          <w:t>@ac.upatras.gr</w:t>
+                          <w:t>@</w:t>
+                        </w:r>
+                        <w:r>
+                          <w:rPr>
+                            <w:rStyle w:val="Hyperlink"/>
+                            <w:rFonts w:asciiTheme="minorHAnsi" w:hAnsiTheme="minorHAnsi"/>
+                            <w:sz w:val="28"/>
+                            <w:szCs w:val="28"/>
+                          </w:rPr>
+                          <w:t>ac</w:t>
+                        </w:r>
+                        <w:r>
+                          <w:rPr>
+                            <w:rStyle w:val="Hyperlink"/>
+                            <w:rFonts w:asciiTheme="minorHAnsi" w:hAnsiTheme="minorHAnsi"/>
+                            <w:sz w:val="28"/>
+                            <w:szCs w:val="28"/>
+                            <w:lang w:val="el-GR"/>
+                          </w:rPr>
+                          <w:t>.</w:t>
+                        </w:r>
+                        <w:r>
+                          <w:rPr>
+                            <w:rStyle w:val="Hyperlink"/>
+                            <w:rFonts w:asciiTheme="minorHAnsi" w:hAnsiTheme="minorHAnsi"/>
+                            <w:sz w:val="28"/>
+                            <w:szCs w:val="28"/>
+                          </w:rPr>
+                          <w:t>upatras</w:t>
+                        </w:r>
+                        <w:r>
+                          <w:rPr>
+                            <w:rStyle w:val="Hyperlink"/>
+                            <w:rFonts w:asciiTheme="minorHAnsi" w:hAnsiTheme="minorHAnsi"/>
+                            <w:sz w:val="28"/>
+                            <w:szCs w:val="28"/>
+                            <w:lang w:val="el-GR"/>
+                          </w:rPr>
+                          <w:t>.</w:t>
+                        </w:r>
+                        <w:r>
+                          <w:rPr>
+                            <w:rStyle w:val="Hyperlink"/>
+                            <w:rFonts w:asciiTheme="minorHAnsi" w:hAnsiTheme="minorHAnsi"/>
+                            <w:sz w:val="28"/>
+                            <w:szCs w:val="28"/>
+                          </w:rPr>
+                          <w:t>gr</w:t>
                         </w:r>
                       </w:hyperlink>
                     </w:p>
@@ -5608,6 +5845,7 @@
                           <w:color w:val="153D63" w:themeColor="text2" w:themeTint="E6"/>
                           <w:sz w:val="28"/>
                           <w:szCs w:val="28"/>
+                          <w:lang w:val="el-GR"/>
                         </w:rPr>
                       </w:pPr>
                     </w:p>
@@ -5800,22 +6038,14 @@
         </w:rPr>
       </w:pPr>
     </w:p>
-    <w:p>
-      <w:pPr>
-        <w:jc w:val="center"/>
-        <w:rPr>
-          <w:rFonts w:asciiTheme="minorHAnsi" w:hAnsiTheme="minorHAnsi"/>
-          <w:b/>
-          <w:bCs/>
-          <w:color w:val="153D63" w:themeColor="text2" w:themeTint="E6"/>
-          <w:sz w:val="48"/>
-          <w:szCs w:val="48"/>
-          <w:lang w:val="el-GR"/>
-        </w:rPr>
-      </w:pPr>
-    </w:p>
     <w:sdt>
       <w:sdtPr>
+        <w:rPr>
+          <w:rFonts w:ascii="Times New Roman" w:eastAsia="Times New Roman" w:hAnsi="Times New Roman" w:cs="Times New Roman"/>
+          <w:color w:val="auto"/>
+          <w:sz w:val="24"/>
+          <w:szCs w:val="24"/>
+        </w:rPr>
         <w:id w:val="-1073804443"/>
         <w:docPartObj>
           <w:docPartGallery w:val="Table of Contents"/>
@@ -5824,13 +6054,9 @@
       </w:sdtPr>
       <w:sdtEndPr>
         <w:rPr>
-          <w:rFonts w:ascii="Times New Roman" w:eastAsia="Times New Roman" w:hAnsi="Times New Roman" w:cs="Times New Roman"/>
           <w:b/>
           <w:bCs/>
           <w:noProof/>
-          <w:color w:val="auto"/>
-          <w:sz w:val="24"/>
-          <w:szCs w:val="24"/>
         </w:rPr>
       </w:sdtEndPr>
       <w:sdtContent>

</xml_diff>